<commit_message>
add resume data, template and generation scripts
</commit_message>
<xml_diff>
--- a/template.docx
+++ b/template.docx
@@ -247,20 +247,6 @@
           <w:szCs w:val="20"/>
         </w:rPr>
         <w:t xml:space="preserve">• {{B5}}</w:t>
-      </w:r>
-    </w:p>
-    <w:p>
-      <w:pPr>
-        <w:spacing w:before="40" w:after="40"/>
-        <w:ind w:left="215"/>
-      </w:pPr>
-      <w:r>
-        <w:rPr>
-          <w:color w:val="1a1a1a"/>
-          <w:sz w:val="20"/>
-          <w:szCs w:val="20"/>
-        </w:rPr>
-        <w:t xml:space="preserve">• {{B6}}</w:t>
       </w:r>
     </w:p>
     <w:p>

</xml_diff>

<commit_message>
integrate aws bedrock with ats scoring and cost logging
</commit_message>
<xml_diff>
--- a/template.docx
+++ b/template.docx
@@ -29,7 +29,7 @@
           <w:sz w:val="18"/>
           <w:szCs w:val="18"/>
         </w:rPr>
-        <w:t xml:space="preserve">Jind, Haryana, India | ajayluhach4@gmail.com | 9996033865</w:t>
+        <w:t xml:space="preserve">Jind, Haryana, India |  | </w:t>
       </w:r>
     </w:p>
     <w:p>
@@ -43,7 +43,7 @@
           <w:sz w:val="18"/>
           <w:szCs w:val="18"/>
         </w:rPr>
-        <w:t xml:space="preserve">github.com/AjayLuhach | linkedin.com/in/ajayluhach7 | ajayluhach.in</w:t>
+        <w:t xml:space="preserve"> |  | </w:t>
       </w:r>
     </w:p>
     <w:p>
@@ -298,203 +298,77 @@
           <w:sz w:val="20"/>
           <w:szCs w:val="20"/>
         </w:rPr>
-        <w:t xml:space="preserve">• Built automation and data processing scripts using Python, Pandas, and Requests</w:t>
-      </w:r>
-    </w:p>
-    <w:p>
-      <w:pPr>
-        <w:spacing w:before="40" w:after="40"/>
-        <w:ind w:left="215"/>
-      </w:pPr>
-      <w:r>
-        <w:rPr>
-          <w:color w:val="1a1a1a"/>
-          <w:sz w:val="20"/>
-          <w:szCs w:val="20"/>
-        </w:rPr>
-        <w:t xml:space="preserve">• Developed REST APIs and backend logic for server-side applications</w:t>
-      </w:r>
-    </w:p>
-    <w:p>
-      <w:pPr>
-        <w:spacing w:before="40" w:after="40"/>
-        <w:ind w:left="215"/>
-      </w:pPr>
-      <w:r>
-        <w:rPr>
-          <w:color w:val="1a1a1a"/>
-          <w:sz w:val="20"/>
-          <w:szCs w:val="20"/>
-        </w:rPr>
-        <w:t xml:space="preserve">• Gained hands-on experience in debugging and API integration tasks</w:t>
-      </w:r>
-    </w:p>
-    <w:p>
-      <w:pPr>
-        <w:spacing w:before="250" w:after="80"/>
-      </w:pPr>
-      <w:r>
-        <w:rPr>
-          <w:b/>
-          <w:bCs/>
-          <w:color w:val="1a1a1a"/>
-          <w:sz w:val="22"/>
-          <w:szCs w:val="22"/>
-        </w:rPr>
-        <w:t xml:space="preserve">PROJECTS</w:t>
-      </w:r>
-    </w:p>
-    <w:p>
-      <w:pPr>
-        <w:pBdr>
-          <w:bottom w:val="single" w:color="cccccc" w:sz="4" w:space="1"/>
-        </w:pBdr>
-        <w:spacing w:after="150"/>
-      </w:pPr>
-    </w:p>
-    <w:p>
-      <w:pPr>
-        <w:spacing w:before="80"/>
-      </w:pPr>
-      <w:r>
-        <w:rPr>
-          <w:b/>
-          <w:bCs/>
-          <w:sz w:val="20"/>
-          <w:szCs w:val="20"/>
-        </w:rPr>
-        <w:t xml:space="preserve">GetStatus – Urban Renewal Platform</w:t>
-      </w:r>
-    </w:p>
-    <w:p>
-      <w:pPr>
-        <w:spacing w:after="80"/>
-      </w:pPr>
-      <w:r>
-        <w:rPr>
-          <w:color w:val="4a4a4a"/>
-          <w:sz w:val="18"/>
-          <w:szCs w:val="18"/>
-        </w:rPr>
-        <w:t xml:space="preserve">Enterprise platform for managing urban projects in Israel using React, Angular, Node.js, MongoDB. Improved stakeholder communication and project transparency.</w:t>
-      </w:r>
-    </w:p>
-    <w:p>
-      <w:r>
-        <w:rPr>
-          <w:b/>
-          <w:bCs/>
-          <w:sz w:val="20"/>
-          <w:szCs w:val="20"/>
-        </w:rPr>
-        <w:t xml:space="preserve">HRMS Internal System</w:t>
-      </w:r>
-    </w:p>
-    <w:p>
-      <w:pPr>
-        <w:spacing w:after="80"/>
-      </w:pPr>
-      <w:r>
-        <w:rPr>
-          <w:color w:val="4a4a4a"/>
-          <w:sz w:val="18"/>
-          <w:szCs w:val="18"/>
-        </w:rPr>
-        <w:t xml:space="preserve">Full-stack HR management system with attendance integration, leave &amp; loan modules, and responsive dashboards.</w:t>
-      </w:r>
-    </w:p>
-    <w:p>
-      <w:r>
-        <w:rPr>
-          <w:b/>
-          <w:bCs/>
-          <w:sz w:val="20"/>
-          <w:szCs w:val="20"/>
-        </w:rPr>
-        <w:t xml:space="preserve">Bibico – Influencer Marketing Platform</w:t>
-      </w:r>
-    </w:p>
-    <w:p>
-      <w:pPr>
-        <w:spacing w:after="80"/>
-      </w:pPr>
-      <w:r>
-        <w:rPr>
-          <w:color w:val="4a4a4a"/>
-          <w:sz w:val="18"/>
-          <w:szCs w:val="18"/>
-        </w:rPr>
-        <w:t xml:space="preserve">Multi-language platform connecting brands and influencers with i18n, Express, Sequelize, and SQL.</w:t>
-      </w:r>
-    </w:p>
-    <w:p>
-      <w:r>
-        <w:rPr>
-          <w:b/>
-          <w:bCs/>
-          <w:sz w:val="20"/>
-          <w:szCs w:val="20"/>
-        </w:rPr>
-        <w:t xml:space="preserve">Personal Portfolio – ajayluhach.in</w:t>
-      </w:r>
-    </w:p>
-    <w:p>
-      <w:pPr>
-        <w:spacing w:after="100"/>
-      </w:pPr>
-      <w:r>
-        <w:rPr>
-          <w:color w:val="4a4a4a"/>
-          <w:sz w:val="18"/>
-          <w:szCs w:val="18"/>
-        </w:rPr>
-        <w:t xml:space="preserve">Next.js portfolio with multi-theme setup, responsive design, animations, and SSR/SEO optimization.</w:t>
-      </w:r>
-    </w:p>
-    <w:p>
-      <w:pPr>
-        <w:spacing w:before="250" w:after="80"/>
-      </w:pPr>
-      <w:r>
-        <w:rPr>
-          <w:b/>
-          <w:bCs/>
-          <w:color w:val="1a1a1a"/>
-          <w:sz w:val="22"/>
-          <w:szCs w:val="22"/>
-        </w:rPr>
-        <w:t xml:space="preserve">EDUCATION</w:t>
-      </w:r>
-    </w:p>
-    <w:p>
-      <w:pPr>
-        <w:pBdr>
-          <w:bottom w:val="single" w:color="cccccc" w:sz="4" w:space="1"/>
-        </w:pBdr>
-        <w:spacing w:after="150"/>
-      </w:pPr>
-    </w:p>
-    <w:p>
-      <w:r>
-        <w:rPr>
-          <w:b/>
-          <w:bCs/>
-          <w:sz w:val="20"/>
-          <w:szCs w:val="20"/>
-        </w:rPr>
-        <w:t xml:space="preserve">Diploma in Computer Engineering</w:t>
-      </w:r>
-      <w:r>
-        <w:rPr>
-          <w:sz w:val="20"/>
-          <w:szCs w:val="20"/>
-        </w:rPr>
-        <w:t xml:space="preserve"> — Chhotu Ram Polytechnic, Rohtak</w:t>
-      </w:r>
-    </w:p>
-    <w:p>
-      <w:pPr>
-        <w:spacing w:after="80"/>
+        <w:t xml:space="preserve">• Built automation and data processing scripts using Python, Pandas, and Requests library</w:t>
+      </w:r>
+    </w:p>
+    <w:p>
+      <w:pPr>
+        <w:spacing w:before="40" w:after="40"/>
+        <w:ind w:left="215"/>
+      </w:pPr>
+      <w:r>
+        <w:rPr>
+          <w:color w:val="1a1a1a"/>
+          <w:sz w:val="20"/>
+          <w:szCs w:val="20"/>
+        </w:rPr>
+        <w:t xml:space="preserve">• Developed REST APIs and backend logic to strengthen server-side development skills</w:t>
+      </w:r>
+    </w:p>
+    <w:p>
+      <w:pPr>
+        <w:spacing w:before="40" w:after="40"/>
+        <w:ind w:left="215"/>
+      </w:pPr>
+      <w:r>
+        <w:rPr>
+          <w:color w:val="1a1a1a"/>
+          <w:sz w:val="20"/>
+          <w:szCs w:val="20"/>
+        </w:rPr>
+        <w:t xml:space="preserve">• Gained hands-on experience in debugging, testing, and API integration tasks</w:t>
+      </w:r>
+    </w:p>
+    <w:p>
+      <w:pPr>
+        <w:spacing w:before="40" w:after="40"/>
+        <w:ind w:left="215"/>
+      </w:pPr>
+      <w:r>
+        <w:rPr>
+          <w:color w:val="1a1a1a"/>
+          <w:sz w:val="20"/>
+          <w:szCs w:val="20"/>
+        </w:rPr>
+        <w:t xml:space="preserve">• Worked on data extraction and transformation pipelines for various use cases</w:t>
+      </w:r>
+    </w:p>
+    <w:p>
+      <w:pPr>
+        <w:spacing w:before="150" w:after="0"/>
+      </w:pPr>
+      <w:r>
+        <w:rPr>
+          <w:b/>
+          <w:bCs/>
+          <w:color w:val="1a1a1a"/>
+          <w:sz w:val="20"/>
+          <w:szCs w:val="20"/>
+        </w:rPr>
+        <w:t xml:space="preserve">Team Lead</w:t>
+      </w:r>
+      <w:r>
+        <w:rPr>
+          <w:color w:val="1a1a1a"/>
+          <w:sz w:val="20"/>
+          <w:szCs w:val="20"/>
+        </w:rPr>
+        <w:t xml:space="preserve"> — College Hackathon</w:t>
+      </w:r>
+    </w:p>
+    <w:p>
+      <w:pPr>
+        <w:spacing w:before="0" w:after="80"/>
       </w:pPr>
       <w:r>
         <w:rPr>
@@ -504,6 +378,222 @@
           <w:sz w:val="18"/>
           <w:szCs w:val="18"/>
         </w:rPr>
+        <w:t xml:space="preserve">Sonipat | Jan 2023 – Mar 2023</w:t>
+      </w:r>
+    </w:p>
+    <w:p>
+      <w:pPr>
+        <w:spacing w:before="40" w:after="40"/>
+        <w:ind w:left="215"/>
+      </w:pPr>
+      <w:r>
+        <w:rPr>
+          <w:color w:val="1a1a1a"/>
+          <w:sz w:val="20"/>
+          <w:szCs w:val="20"/>
+        </w:rPr>
+        <w:t xml:space="preserve">• Led a 3-member cross-functional team to build a College Management mobile application using Java, Android Studio, and Firebase (NoSQL database + authentication + real-time sync)</w:t>
+      </w:r>
+    </w:p>
+    <w:p>
+      <w:pPr>
+        <w:spacing w:before="40" w:after="40"/>
+        <w:ind w:left="215"/>
+      </w:pPr>
+      <w:r>
+        <w:rPr>
+          <w:color w:val="1a1a1a"/>
+          <w:sz w:val="20"/>
+          <w:szCs w:val="20"/>
+        </w:rPr>
+        <w:t xml:space="preserve">• Implemented role-based access control (RBAC) with separate dashboards for students, teachers, and administrators with real-time data synchronization features</w:t>
+      </w:r>
+    </w:p>
+    <w:p>
+      <w:pPr>
+        <w:spacing w:before="40" w:after="40"/>
+        <w:ind w:left="215"/>
+      </w:pPr>
+      <w:r>
+        <w:rPr>
+          <w:color w:val="1a1a1a"/>
+          <w:sz w:val="20"/>
+          <w:szCs w:val="20"/>
+        </w:rPr>
+        <w:t xml:space="preserve">• Applied problem-solving, algorithm design, and mobile app development best practices</w:t>
+      </w:r>
+    </w:p>
+    <w:p>
+      <w:pPr>
+        <w:spacing w:before="40" w:after="40"/>
+        <w:ind w:left="215"/>
+      </w:pPr>
+      <w:r>
+        <w:rPr>
+          <w:color w:val="1a1a1a"/>
+          <w:sz w:val="20"/>
+          <w:szCs w:val="20"/>
+        </w:rPr>
+        <w:t xml:space="preserve">• Won 1st Place in the Software Development category through effective team collaboration, project management, and technical execution</w:t>
+      </w:r>
+    </w:p>
+    <w:p>
+      <w:pPr>
+        <w:spacing w:before="250" w:after="80"/>
+      </w:pPr>
+      <w:r>
+        <w:rPr>
+          <w:b/>
+          <w:bCs/>
+          <w:color w:val="1a1a1a"/>
+          <w:sz w:val="22"/>
+          <w:szCs w:val="22"/>
+        </w:rPr>
+        <w:t xml:space="preserve">PROJECTS</w:t>
+      </w:r>
+    </w:p>
+    <w:p>
+      <w:pPr>
+        <w:pBdr>
+          <w:bottom w:val="single" w:color="cccccc" w:sz="4" w:space="1"/>
+        </w:pBdr>
+        <w:spacing w:after="150"/>
+      </w:pPr>
+    </w:p>
+    <w:p>
+      <w:pPr>
+        <w:spacing w:before="80"/>
+      </w:pPr>
+      <w:r>
+        <w:rPr>
+          <w:b/>
+          <w:bCs/>
+          <w:sz w:val="20"/>
+          <w:szCs w:val="20"/>
+        </w:rPr>
+        <w:t xml:space="preserve">AccentLoop (Freelance, Japan)</w:t>
+      </w:r>
+    </w:p>
+    <w:p>
+      <w:pPr>
+        <w:spacing w:after="80"/>
+      </w:pPr>
+      <w:r>
+        <w:rPr>
+          <w:color w:val="4a4a4a"/>
+          <w:sz w:val="18"/>
+          <w:szCs w:val="18"/>
+        </w:rPr>
+        <w:t xml:space="preserve">{{P_ACCENTLOOPFREELANCEJAPAN}}</w:t>
+      </w:r>
+    </w:p>
+    <w:p>
+      <w:pPr>
+        <w:spacing w:before="0"/>
+      </w:pPr>
+      <w:r>
+        <w:rPr>
+          <w:b/>
+          <w:bCs/>
+          <w:sz w:val="20"/>
+          <w:szCs w:val="20"/>
+        </w:rPr>
+        <w:t xml:space="preserve">ResumeForge (ATS Tailoring Tool)</w:t>
+      </w:r>
+    </w:p>
+    <w:p>
+      <w:pPr>
+        <w:spacing w:after="80"/>
+      </w:pPr>
+      <w:r>
+        <w:rPr>
+          <w:color w:val="4a4a4a"/>
+          <w:sz w:val="18"/>
+          <w:szCs w:val="18"/>
+        </w:rPr>
+        <w:t xml:space="preserve">{{P_RESUMEFORGEATSTAILORINGTOOL}}</w:t>
+      </w:r>
+    </w:p>
+    <w:p>
+      <w:pPr>
+        <w:spacing w:before="0"/>
+      </w:pPr>
+      <w:r>
+        <w:rPr>
+          <w:b/>
+          <w:bCs/>
+          <w:sz w:val="20"/>
+          <w:szCs w:val="20"/>
+        </w:rPr>
+        <w:t xml:space="preserve">Personal Portfolio Website</w:t>
+      </w:r>
+    </w:p>
+    <w:p>
+      <w:pPr>
+        <w:spacing w:after="100"/>
+      </w:pPr>
+      <w:r>
+        <w:rPr>
+          <w:color w:val="4a4a4a"/>
+          <w:sz w:val="18"/>
+          <w:szCs w:val="18"/>
+        </w:rPr>
+        <w:t xml:space="preserve">{{P_PERSONALPORTFOLIOWEBSITE}}</w:t>
+      </w:r>
+    </w:p>
+    <w:p>
+      <w:pPr>
+        <w:spacing w:before="250" w:after="80"/>
+      </w:pPr>
+      <w:r>
+        <w:rPr>
+          <w:b/>
+          <w:bCs/>
+          <w:color w:val="1a1a1a"/>
+          <w:sz w:val="22"/>
+          <w:szCs w:val="22"/>
+        </w:rPr>
+        <w:t xml:space="preserve">EDUCATION</w:t>
+      </w:r>
+    </w:p>
+    <w:p>
+      <w:pPr>
+        <w:pBdr>
+          <w:bottom w:val="single" w:color="cccccc" w:sz="4" w:space="1"/>
+        </w:pBdr>
+        <w:spacing w:after="150"/>
+      </w:pPr>
+    </w:p>
+    <w:p>
+      <w:r>
+        <w:rPr>
+          <w:b/>
+          <w:bCs/>
+          <w:sz w:val="20"/>
+          <w:szCs w:val="20"/>
+        </w:rPr>
+        <w:t xml:space="preserve">Diploma in Computer Engineering</w:t>
+      </w:r>
+      <w:r>
+        <w:rPr>
+          <w:sz w:val="20"/>
+          <w:szCs w:val="20"/>
+        </w:rPr>
+        <w:t xml:space="preserve"> — Chhotu Ram Polytechnic, Rohtak</w:t>
+      </w:r>
+    </w:p>
+    <w:p>
+      <w:pPr>
+        <w:spacing w:after="80"/>
+      </w:pPr>
+      <w:r>
+        <w:rPr>
+          <w:i/>
+          <w:iCs/>
+          <w:color w:val="4a4a4a"/>
+          <w:sz w:val="18"/>
+          <w:szCs w:val="18"/>
+        </w:rPr>
         <w:t xml:space="preserve">Aug 2021 - July 2023 | 84%</w:t>
       </w:r>
     </w:p>
@@ -515,7 +605,7 @@
           <w:sz w:val="20"/>
           <w:szCs w:val="20"/>
         </w:rPr>
-        <w:t xml:space="preserve">High School (Non-Medical)</w:t>
+        <w:t xml:space="preserve">Non-Medical (High School)</w:t>
       </w:r>
       <w:r>
         <w:rPr>
@@ -526,6 +616,9 @@
       </w:r>
     </w:p>
     <w:p>
+      <w:pPr>
+        <w:spacing w:after="80"/>
+      </w:pPr>
       <w:r>
         <w:rPr>
           <w:i/>

</xml_diff>